<commit_message>
Clarify that the $25B guide raise is supply optimization plus demand
Tighten the cover and supply-chain callouts so the raise is not framed as demand-only or supply-only.

Co-authored-by: choijunh-cloud <choijunh-cloud@users.noreply.github.com>
</commit_message>
<xml_diff>
--- a/lectures/9월 1일 Dell Q2 FY2027 실적콜.docx
+++ b/lectures/9월 1일 Dell Q2 FY2027 실적콜.docx
@@ -153,7 +153,7 @@
                 <w:color w:val="1A1A1A"/>
                 <w:sz w:val="21"/>
               </w:rPr>
-              <w:t>병목은 수요가 아니라 공급입니다. Clarke는 DRAM, DRAM, 그다음 NAND, NAND라고 두 번 말했습니다. 연간 가이던스 +$250억은 수요 상향이 아니라 부품을 인프라로 재배분해 출하를 끌어올린 결과입니다.</w:t>
+              <w:t>병목은 수요가 아니라 공급입니다. Clarke는 DRAM, DRAM, 그다음 NAND, NAND라고 두 번 말했습니다. 연간 가이던스 +$250억은 수요가 갑자기 더 세진 것만으로 설명되지 않습니다. 가진 비트를 인프라로 재배치해 출하를 끌어올린 결과입니다.</w:t>
             </w:r>
           </w:p>
           <w:p>
@@ -15127,7 +15127,7 @@
                 <w:color w:val="1A1A1A"/>
                 <w:sz w:val="21"/>
               </w:rPr>
-              <w:t>Dell이 가이던스를 $250억 올린 이유는 수요가 갑자기 더 세져서가 아니라, 가진 비트를 인프라로 재배치해 출하를 끌어올렸기 때문입니다.</w:t>
+              <w:t>Dell이 가이던스를 $250억 올린 직접 이유는, Clarke 표현대로, 가진 비트를 인프라로 재배치하고 공장 산출을 끌어올린 것입니다. 라인별 수요 상향도 같이 들어가 있습니다.</w:t>
             </w:r>
           </w:p>
         </w:tc>

</xml_diff>